<commit_message>
feat: add trip cancellation and place exploration
</commit_message>
<xml_diff>
--- a/docs/Links.docx
+++ b/docs/Links.docx
@@ -25,6 +25,34 @@
     </w:p>
     <w:p/>
     <w:p>
+      <w:r>
+        <w:t>Phase TWO Presentation</w:t>
+      </w:r>
+    </w:p>
+    <w:p>
+      <w:hyperlink r:id="rId4" w:history="1">
+        <w:r>
+          <w:rPr>
+            <w:rStyle w:val="Hyperlink"/>
+          </w:rPr>
+          <w:t>https://canva.link/j7dzz3zhm</w:t>
+        </w:r>
+        <w:r>
+          <w:rPr>
+            <w:rStyle w:val="Hyperlink"/>
+          </w:rPr>
+          <w:t>8</w:t>
+        </w:r>
+        <w:r>
+          <w:rPr>
+            <w:rStyle w:val="Hyperlink"/>
+          </w:rPr>
+          <w:t>hktu0</w:t>
+        </w:r>
+      </w:hyperlink>
+    </w:p>
+    <w:p/>
+    <w:p>
       <w:pPr>
         <w:rPr>
           <w:rStyle w:val="Hyperlink"/>
@@ -51,7 +79,7 @@
       <w:r>
         <w:br/>
       </w:r>
-      <w:hyperlink r:id="rId4" w:history="1">
+      <w:hyperlink r:id="rId5" w:history="1">
         <w:r>
           <w:rPr>
             <w:rStyle w:val="Hyperlink"/>
@@ -68,7 +96,7 @@
       <w:r>
         <w:br/>
       </w:r>
-      <w:hyperlink r:id="rId5" w:history="1">
+      <w:hyperlink r:id="rId6" w:history="1">
         <w:r>
           <w:rPr>
             <w:rStyle w:val="Hyperlink"/>
@@ -89,7 +117,7 @@
           <w:rStyle w:val="Hyperlink"/>
         </w:rPr>
       </w:pPr>
-      <w:hyperlink r:id="rId6" w:history="1">
+      <w:hyperlink r:id="rId7" w:history="1">
         <w:r>
           <w:rPr>
             <w:rStyle w:val="Hyperlink"/>
@@ -122,7 +150,7 @@
           <w:u w:val="single"/>
         </w:rPr>
       </w:pPr>
-      <w:hyperlink r:id="rId7" w:history="1">
+      <w:hyperlink r:id="rId8" w:history="1">
         <w:r>
           <w:rPr>
             <w:rStyle w:val="Hyperlink"/>
@@ -146,7 +174,6 @@
         <w:ind w:left="720" w:hanging="720"/>
       </w:pPr>
       <w:r>
-        <w:lastRenderedPageBreak/>
         <w:t>Tour Planning Sequence Diagram</w:t>
       </w:r>
     </w:p>
@@ -156,7 +183,7 @@
           <w:rStyle w:val="Hyperlink"/>
         </w:rPr>
       </w:pPr>
-      <w:hyperlink r:id="rId8" w:history="1">
+      <w:hyperlink r:id="rId9" w:history="1">
         <w:r>
           <w:rPr>
             <w:rStyle w:val="Hyperlink"/>
@@ -179,7 +206,7 @@
           <w:rStyle w:val="Hyperlink"/>
         </w:rPr>
       </w:pPr>
-      <w:hyperlink r:id="rId9" w:history="1">
+      <w:hyperlink r:id="rId10" w:history="1">
         <w:r>
           <w:rPr>
             <w:rStyle w:val="Hyperlink"/>
@@ -207,7 +234,7 @@
           <w:rStyle w:val="Hyperlink"/>
         </w:rPr>
       </w:pPr>
-      <w:hyperlink r:id="rId10" w:history="1">
+      <w:hyperlink r:id="rId11" w:history="1">
         <w:r>
           <w:rPr>
             <w:rStyle w:val="Hyperlink"/>
@@ -237,7 +264,7 @@
           <w:rStyle w:val="Hyperlink"/>
         </w:rPr>
       </w:pPr>
-      <w:hyperlink r:id="rId11" w:history="1">
+      <w:hyperlink r:id="rId12" w:history="1">
         <w:r>
           <w:rPr>
             <w:rStyle w:val="Hyperlink"/>

</xml_diff>